<commit_message>
4 files; change http to https
4 files; change http to https
NKNUIOT_POPIOTData.pdf
NKNUIOT_QueryIOT.pdf
NKNUIOT_IOTRead_Field.pdf
NKNUIOT_IOTReadCount.pdf
</commit_message>
<xml_diff>
--- a/word/NKNUIOT_IOTReadCount.docx
+++ b/word/NKNUIOT_IOTReadCount.docx
@@ -1,6 +1,6 @@
 
 <file path=word/document.xml><?xml version="1.0" encoding="utf-8"?>
-<w:document xmlns:wpc="http://schemas.microsoft.com/office/word/2010/wordprocessingCanvas" xmlns:cx="http://schemas.microsoft.com/office/drawing/2014/chartex" xmlns:cx1="http://schemas.microsoft.com/office/drawing/2015/9/8/chartex" xmlns:cx2="http://schemas.microsoft.com/office/drawing/2015/10/21/chartex" xmlns:cx3="http://schemas.microsoft.com/office/drawing/2016/5/9/chartex" xmlns:cx4="http://schemas.microsoft.com/office/drawing/2016/5/10/chartex" xmlns:cx5="http://schemas.microsoft.com/office/drawing/2016/5/11/chartex" xmlns:cx6="http://schemas.microsoft.com/office/drawing/2016/5/12/chartex" xmlns:cx7="http://schemas.microsoft.com/office/drawing/2016/5/13/chartex" xmlns:cx8="http://schemas.microsoft.com/office/drawing/2016/5/14/chartex" xmlns:mc="http://schemas.openxmlformats.org/markup-compatibility/2006" xmlns:aink="http://schemas.microsoft.com/office/drawing/2016/ink" xmlns:am3d="http://schemas.microsoft.com/office/drawing/2017/model3d" xmlns:o="urn:schemas-microsoft-com:office:office" xmlns:r="http://schemas.openxmlformats.org/officeDocument/2006/relationships" xmlns:m="http://schemas.openxmlformats.org/officeDocument/2006/math" xmlns:v="urn:schemas-microsoft-com:vml" xmlns:wp14="http://schemas.microsoft.com/office/word/2010/wordprocessingDrawing" xmlns:wp="http://schemas.openxmlformats.org/drawingml/2006/wordprocessingDrawing" xmlns:w10="urn:schemas-microsoft-com:office:word" xmlns:w="http://schemas.openxmlformats.org/wordprocessingml/2006/main" xmlns:w14="http://schemas.microsoft.com/office/word/2010/wordml" xmlns:w15="http://schemas.microsoft.com/office/word/2012/wordml" xmlns:w16cid="http://schemas.microsoft.com/office/word/2016/wordml/cid" xmlns:w16se="http://schemas.microsoft.com/office/word/2015/wordml/symex" xmlns:wpg="http://schemas.microsoft.com/office/word/2010/wordprocessingGroup" xmlns:wpi="http://schemas.microsoft.com/office/word/2010/wordprocessingInk" xmlns:wne="http://schemas.microsoft.com/office/word/2006/wordml" xmlns:wps="http://schemas.microsoft.com/office/word/2010/wordprocessingShape" mc:Ignorable="w14 w15 w16se w16cid wp14">
+<w:document xmlns:wpc="http://schemas.microsoft.com/office/word/2010/wordprocessingCanvas" xmlns:cx="http://schemas.microsoft.com/office/drawing/2014/chartex" xmlns:mc="http://schemas.openxmlformats.org/markup-compatibility/2006" xmlns:o="urn:schemas-microsoft-com:office:office" xmlns:r="http://schemas.openxmlformats.org/officeDocument/2006/relationships" xmlns:m="http://schemas.openxmlformats.org/officeDocument/2006/math" xmlns:v="urn:schemas-microsoft-com:vml" xmlns:wp14="http://schemas.microsoft.com/office/word/2010/wordprocessingDrawing" xmlns:wp="http://schemas.openxmlformats.org/drawingml/2006/wordprocessingDrawing" xmlns:w10="urn:schemas-microsoft-com:office:word" xmlns:w="http://schemas.openxmlformats.org/wordprocessingml/2006/main" xmlns:w14="http://schemas.microsoft.com/office/word/2010/wordml" xmlns:w15="http://schemas.microsoft.com/office/word/2012/wordml" xmlns:w16se="http://schemas.microsoft.com/office/word/2015/wordml/symex" xmlns:wpg="http://schemas.microsoft.com/office/word/2010/wordprocessingGroup" xmlns:wpi="http://schemas.microsoft.com/office/word/2010/wordprocessingInk" xmlns:wne="http://schemas.microsoft.com/office/word/2006/wordml" xmlns:wps="http://schemas.microsoft.com/office/word/2010/wordprocessingShape" mc:Ignorable="w14 w15 w16se wp14">
   <w:body>
     <w:p>
       <w:r>
@@ -393,7 +393,20 @@
                 <w:rPr>
                   <w:rStyle w:val="a6"/>
                 </w:rPr>
-                <w:t>http://iot.nknu.edu.tw/Cloud/Login.aspx</w:t>
+                <w:t>http</w:t>
+              </w:r>
+              <w:r>
+                <w:rPr>
+                  <w:rStyle w:val="a6"/>
+                  <w:rFonts w:hint="eastAsia"/>
+                </w:rPr>
+                <w:t>s</w:t>
+              </w:r>
+              <w:r>
+                <w:rPr>
+                  <w:rStyle w:val="a6"/>
+                </w:rPr>
+                <w:t>://iot.nknu.edu.tw/Cloud/Login.aspx</w:t>
               </w:r>
             </w:hyperlink>
           </w:p>
@@ -426,7 +439,21 @@
                 <w:rPr>
                   <w:rStyle w:val="a6"/>
                 </w:rPr>
-                <w:t>http://iottest.nknu.edu.tw/Cloud/Login.aspx</w:t>
+                <w:t>http</w:t>
+              </w:r>
+              <w:r>
+                <w:rPr>
+                  <w:rStyle w:val="a6"/>
+                </w:rPr>
+                <w:t>s</w:t>
+              </w:r>
+              <w:bookmarkStart w:id="0" w:name="_GoBack"/>
+              <w:bookmarkEnd w:id="0"/>
+              <w:r>
+                <w:rPr>
+                  <w:rStyle w:val="a6"/>
+                </w:rPr>
+                <w:t>://iottest.nknu.edu.tw/Cloud/Login.aspx</w:t>
               </w:r>
             </w:hyperlink>
           </w:p>
@@ -793,8 +820,6 @@
           </wp:inline>
         </w:drawing>
       </w:r>
-      <w:bookmarkStart w:id="0" w:name="_GoBack"/>
-      <w:bookmarkEnd w:id="0"/>
     </w:p>
     <w:p>
       <w:pPr>
@@ -1212,7 +1237,7 @@
 </file>
 
 <file path=word/endnotes.xml><?xml version="1.0" encoding="utf-8"?>
-<w:endnotes xmlns:wpc="http://schemas.microsoft.com/office/word/2010/wordprocessingCanvas" xmlns:cx="http://schemas.microsoft.com/office/drawing/2014/chartex" xmlns:cx1="http://schemas.microsoft.com/office/drawing/2015/9/8/chartex" xmlns:cx2="http://schemas.microsoft.com/office/drawing/2015/10/21/chartex" xmlns:cx3="http://schemas.microsoft.com/office/drawing/2016/5/9/chartex" xmlns:cx4="http://schemas.microsoft.com/office/drawing/2016/5/10/chartex" xmlns:cx5="http://schemas.microsoft.com/office/drawing/2016/5/11/chartex" xmlns:cx6="http://schemas.microsoft.com/office/drawing/2016/5/12/chartex" xmlns:cx7="http://schemas.microsoft.com/office/drawing/2016/5/13/chartex" xmlns:cx8="http://schemas.microsoft.com/office/drawing/2016/5/14/chartex" xmlns:mc="http://schemas.openxmlformats.org/markup-compatibility/2006" xmlns:aink="http://schemas.microsoft.com/office/drawing/2016/ink" xmlns:am3d="http://schemas.microsoft.com/office/drawing/2017/model3d" xmlns:o="urn:schemas-microsoft-com:office:office" xmlns:r="http://schemas.openxmlformats.org/officeDocument/2006/relationships" xmlns:m="http://schemas.openxmlformats.org/officeDocument/2006/math" xmlns:v="urn:schemas-microsoft-com:vml" xmlns:wp14="http://schemas.microsoft.com/office/word/2010/wordprocessingDrawing" xmlns:wp="http://schemas.openxmlformats.org/drawingml/2006/wordprocessingDrawing" xmlns:w10="urn:schemas-microsoft-com:office:word" xmlns:w="http://schemas.openxmlformats.org/wordprocessingml/2006/main" xmlns:w14="http://schemas.microsoft.com/office/word/2010/wordml" xmlns:w15="http://schemas.microsoft.com/office/word/2012/wordml" xmlns:w16cid="http://schemas.microsoft.com/office/word/2016/wordml/cid" xmlns:w16se="http://schemas.microsoft.com/office/word/2015/wordml/symex" xmlns:wpg="http://schemas.microsoft.com/office/word/2010/wordprocessingGroup" xmlns:wpi="http://schemas.microsoft.com/office/word/2010/wordprocessingInk" xmlns:wne="http://schemas.microsoft.com/office/word/2006/wordml" xmlns:wps="http://schemas.microsoft.com/office/word/2010/wordprocessingShape" mc:Ignorable="w14 w15 w16se w16cid wp14">
+<w:endnotes xmlns:wpc="http://schemas.microsoft.com/office/word/2010/wordprocessingCanvas" xmlns:cx="http://schemas.microsoft.com/office/drawing/2014/chartex" xmlns:mc="http://schemas.openxmlformats.org/markup-compatibility/2006" xmlns:o="urn:schemas-microsoft-com:office:office" xmlns:r="http://schemas.openxmlformats.org/officeDocument/2006/relationships" xmlns:m="http://schemas.openxmlformats.org/officeDocument/2006/math" xmlns:v="urn:schemas-microsoft-com:vml" xmlns:wp14="http://schemas.microsoft.com/office/word/2010/wordprocessingDrawing" xmlns:wp="http://schemas.openxmlformats.org/drawingml/2006/wordprocessingDrawing" xmlns:w10="urn:schemas-microsoft-com:office:word" xmlns:w="http://schemas.openxmlformats.org/wordprocessingml/2006/main" xmlns:w14="http://schemas.microsoft.com/office/word/2010/wordml" xmlns:w15="http://schemas.microsoft.com/office/word/2012/wordml" xmlns:w16se="http://schemas.microsoft.com/office/word/2015/wordml/symex" xmlns:wpg="http://schemas.microsoft.com/office/word/2010/wordprocessingGroup" xmlns:wpi="http://schemas.microsoft.com/office/word/2010/wordprocessingInk" xmlns:wne="http://schemas.microsoft.com/office/word/2006/wordml" xmlns:wps="http://schemas.microsoft.com/office/word/2010/wordprocessingShape" mc:Ignorable="w14 w15 w16se wp14">
   <w:endnote w:type="separator" w:id="-1">
     <w:p>
       <w:pPr>
@@ -1237,7 +1262,7 @@
 </file>
 
 <file path=word/footer1.xml><?xml version="1.0" encoding="utf-8"?>
-<w:ftr xmlns:wpc="http://schemas.microsoft.com/office/word/2010/wordprocessingCanvas" xmlns:cx="http://schemas.microsoft.com/office/drawing/2014/chartex" xmlns:cx1="http://schemas.microsoft.com/office/drawing/2015/9/8/chartex" xmlns:cx2="http://schemas.microsoft.com/office/drawing/2015/10/21/chartex" xmlns:cx3="http://schemas.microsoft.com/office/drawing/2016/5/9/chartex" xmlns:cx4="http://schemas.microsoft.com/office/drawing/2016/5/10/chartex" xmlns:cx5="http://schemas.microsoft.com/office/drawing/2016/5/11/chartex" xmlns:cx6="http://schemas.microsoft.com/office/drawing/2016/5/12/chartex" xmlns:cx7="http://schemas.microsoft.com/office/drawing/2016/5/13/chartex" xmlns:cx8="http://schemas.microsoft.com/office/drawing/2016/5/14/chartex" xmlns:mc="http://schemas.openxmlformats.org/markup-compatibility/2006" xmlns:aink="http://schemas.microsoft.com/office/drawing/2016/ink" xmlns:am3d="http://schemas.microsoft.com/office/drawing/2017/model3d" xmlns:o="urn:schemas-microsoft-com:office:office" xmlns:r="http://schemas.openxmlformats.org/officeDocument/2006/relationships" xmlns:m="http://schemas.openxmlformats.org/officeDocument/2006/math" xmlns:v="urn:schemas-microsoft-com:vml" xmlns:wp14="http://schemas.microsoft.com/office/word/2010/wordprocessingDrawing" xmlns:wp="http://schemas.openxmlformats.org/drawingml/2006/wordprocessingDrawing" xmlns:w10="urn:schemas-microsoft-com:office:word" xmlns:w="http://schemas.openxmlformats.org/wordprocessingml/2006/main" xmlns:w14="http://schemas.microsoft.com/office/word/2010/wordml" xmlns:w15="http://schemas.microsoft.com/office/word/2012/wordml" xmlns:w16cid="http://schemas.microsoft.com/office/word/2016/wordml/cid" xmlns:w16se="http://schemas.microsoft.com/office/word/2015/wordml/symex" xmlns:wpg="http://schemas.microsoft.com/office/word/2010/wordprocessingGroup" xmlns:wpi="http://schemas.microsoft.com/office/word/2010/wordprocessingInk" xmlns:wne="http://schemas.microsoft.com/office/word/2006/wordml" xmlns:wps="http://schemas.microsoft.com/office/word/2010/wordprocessingShape" mc:Ignorable="w14 w15 w16se w16cid wp14">
+<w:ftr xmlns:wpc="http://schemas.microsoft.com/office/word/2010/wordprocessingCanvas" xmlns:cx="http://schemas.microsoft.com/office/drawing/2014/chartex" xmlns:mc="http://schemas.openxmlformats.org/markup-compatibility/2006" xmlns:o="urn:schemas-microsoft-com:office:office" xmlns:r="http://schemas.openxmlformats.org/officeDocument/2006/relationships" xmlns:m="http://schemas.openxmlformats.org/officeDocument/2006/math" xmlns:v="urn:schemas-microsoft-com:vml" xmlns:wp14="http://schemas.microsoft.com/office/word/2010/wordprocessingDrawing" xmlns:wp="http://schemas.openxmlformats.org/drawingml/2006/wordprocessingDrawing" xmlns:w10="urn:schemas-microsoft-com:office:word" xmlns:w="http://schemas.openxmlformats.org/wordprocessingml/2006/main" xmlns:w14="http://schemas.microsoft.com/office/word/2010/wordml" xmlns:w15="http://schemas.microsoft.com/office/word/2012/wordml" xmlns:w16se="http://schemas.microsoft.com/office/word/2015/wordml/symex" xmlns:wpg="http://schemas.microsoft.com/office/word/2010/wordprocessingGroup" xmlns:wpi="http://schemas.microsoft.com/office/word/2010/wordprocessingInk" xmlns:wne="http://schemas.microsoft.com/office/word/2006/wordml" xmlns:wps="http://schemas.microsoft.com/office/word/2010/wordprocessingShape" mc:Ignorable="w14 w15 w16se wp14">
   <w:p>
     <w:pPr>
       <w:spacing w:after="0" w:line="259" w:lineRule="auto"/>
@@ -1314,15 +1339,12 @@
 </file>
 
 <file path=word/footer2.xml><?xml version="1.0" encoding="utf-8"?>
-<w:ftr xmlns:wpc="http://schemas.microsoft.com/office/word/2010/wordprocessingCanvas" xmlns:cx="http://schemas.microsoft.com/office/drawing/2014/chartex" xmlns:cx1="http://schemas.microsoft.com/office/drawing/2015/9/8/chartex" xmlns:cx2="http://schemas.microsoft.com/office/drawing/2015/10/21/chartex" xmlns:cx3="http://schemas.microsoft.com/office/drawing/2016/5/9/chartex" xmlns:cx4="http://schemas.microsoft.com/office/drawing/2016/5/10/chartex" xmlns:cx5="http://schemas.microsoft.com/office/drawing/2016/5/11/chartex" xmlns:cx6="http://schemas.microsoft.com/office/drawing/2016/5/12/chartex" xmlns:cx7="http://schemas.microsoft.com/office/drawing/2016/5/13/chartex" xmlns:cx8="http://schemas.microsoft.com/office/drawing/2016/5/14/chartex" xmlns:mc="http://schemas.openxmlformats.org/markup-compatibility/2006" xmlns:aink="http://schemas.microsoft.com/office/drawing/2016/ink" xmlns:am3d="http://schemas.microsoft.com/office/drawing/2017/model3d" xmlns:o="urn:schemas-microsoft-com:office:office" xmlns:r="http://schemas.openxmlformats.org/officeDocument/2006/relationships" xmlns:m="http://schemas.openxmlformats.org/officeDocument/2006/math" xmlns:v="urn:schemas-microsoft-com:vml" xmlns:wp14="http://schemas.microsoft.com/office/word/2010/wordprocessingDrawing" xmlns:wp="http://schemas.openxmlformats.org/drawingml/2006/wordprocessingDrawing" xmlns:w10="urn:schemas-microsoft-com:office:word" xmlns:w="http://schemas.openxmlformats.org/wordprocessingml/2006/main" xmlns:w14="http://schemas.microsoft.com/office/word/2010/wordml" xmlns:w15="http://schemas.microsoft.com/office/word/2012/wordml" xmlns:w16cid="http://schemas.microsoft.com/office/word/2016/wordml/cid" xmlns:w16se="http://schemas.microsoft.com/office/word/2015/wordml/symex" xmlns:wpg="http://schemas.microsoft.com/office/word/2010/wordprocessingGroup" xmlns:wpi="http://schemas.microsoft.com/office/word/2010/wordprocessingInk" xmlns:wne="http://schemas.microsoft.com/office/word/2006/wordml" xmlns:wps="http://schemas.microsoft.com/office/word/2010/wordprocessingShape" mc:Ignorable="w14 w15 w16se w16cid wp14">
+<w:ftr xmlns:wpc="http://schemas.microsoft.com/office/word/2010/wordprocessingCanvas" xmlns:cx="http://schemas.microsoft.com/office/drawing/2014/chartex" xmlns:mc="http://schemas.openxmlformats.org/markup-compatibility/2006" xmlns:o="urn:schemas-microsoft-com:office:office" xmlns:r="http://schemas.openxmlformats.org/officeDocument/2006/relationships" xmlns:m="http://schemas.openxmlformats.org/officeDocument/2006/math" xmlns:v="urn:schemas-microsoft-com:vml" xmlns:wp14="http://schemas.microsoft.com/office/word/2010/wordprocessingDrawing" xmlns:wp="http://schemas.openxmlformats.org/drawingml/2006/wordprocessingDrawing" xmlns:w10="urn:schemas-microsoft-com:office:word" xmlns:w="http://schemas.openxmlformats.org/wordprocessingml/2006/main" xmlns:w14="http://schemas.microsoft.com/office/word/2010/wordml" xmlns:w15="http://schemas.microsoft.com/office/word/2012/wordml" xmlns:w16se="http://schemas.microsoft.com/office/word/2015/wordml/symex" xmlns:wpg="http://schemas.microsoft.com/office/word/2010/wordprocessingGroup" xmlns:wpi="http://schemas.microsoft.com/office/word/2010/wordprocessingInk" xmlns:wne="http://schemas.microsoft.com/office/word/2006/wordml" xmlns:wps="http://schemas.microsoft.com/office/word/2010/wordprocessingShape" mc:Ignorable="w14 w15 w16se wp14">
   <w:p>
     <w:pPr>
       <w:spacing w:after="0" w:line="259" w:lineRule="auto"/>
       <w:ind w:left="0" w:right="370" w:firstLine="0"/>
       <w:jc w:val="right"/>
-      <w:rPr>
-        <w:rFonts w:hint="eastAsia"/>
-      </w:rPr>
     </w:pPr>
     <w:r>
       <w:rPr>
@@ -1388,7 +1410,7 @@
 </file>
 
 <file path=word/footer3.xml><?xml version="1.0" encoding="utf-8"?>
-<w:ftr xmlns:wpc="http://schemas.microsoft.com/office/word/2010/wordprocessingCanvas" xmlns:cx="http://schemas.microsoft.com/office/drawing/2014/chartex" xmlns:cx1="http://schemas.microsoft.com/office/drawing/2015/9/8/chartex" xmlns:cx2="http://schemas.microsoft.com/office/drawing/2015/10/21/chartex" xmlns:cx3="http://schemas.microsoft.com/office/drawing/2016/5/9/chartex" xmlns:cx4="http://schemas.microsoft.com/office/drawing/2016/5/10/chartex" xmlns:cx5="http://schemas.microsoft.com/office/drawing/2016/5/11/chartex" xmlns:cx6="http://schemas.microsoft.com/office/drawing/2016/5/12/chartex" xmlns:cx7="http://schemas.microsoft.com/office/drawing/2016/5/13/chartex" xmlns:cx8="http://schemas.microsoft.com/office/drawing/2016/5/14/chartex" xmlns:mc="http://schemas.openxmlformats.org/markup-compatibility/2006" xmlns:aink="http://schemas.microsoft.com/office/drawing/2016/ink" xmlns:am3d="http://schemas.microsoft.com/office/drawing/2017/model3d" xmlns:o="urn:schemas-microsoft-com:office:office" xmlns:r="http://schemas.openxmlformats.org/officeDocument/2006/relationships" xmlns:m="http://schemas.openxmlformats.org/officeDocument/2006/math" xmlns:v="urn:schemas-microsoft-com:vml" xmlns:wp14="http://schemas.microsoft.com/office/word/2010/wordprocessingDrawing" xmlns:wp="http://schemas.openxmlformats.org/drawingml/2006/wordprocessingDrawing" xmlns:w10="urn:schemas-microsoft-com:office:word" xmlns:w="http://schemas.openxmlformats.org/wordprocessingml/2006/main" xmlns:w14="http://schemas.microsoft.com/office/word/2010/wordml" xmlns:w15="http://schemas.microsoft.com/office/word/2012/wordml" xmlns:w16cid="http://schemas.microsoft.com/office/word/2016/wordml/cid" xmlns:w16se="http://schemas.microsoft.com/office/word/2015/wordml/symex" xmlns:wpg="http://schemas.microsoft.com/office/word/2010/wordprocessingGroup" xmlns:wpi="http://schemas.microsoft.com/office/word/2010/wordprocessingInk" xmlns:wne="http://schemas.microsoft.com/office/word/2006/wordml" xmlns:wps="http://schemas.microsoft.com/office/word/2010/wordprocessingShape" mc:Ignorable="w14 w15 w16se w16cid wp14">
+<w:ftr xmlns:wpc="http://schemas.microsoft.com/office/word/2010/wordprocessingCanvas" xmlns:cx="http://schemas.microsoft.com/office/drawing/2014/chartex" xmlns:mc="http://schemas.openxmlformats.org/markup-compatibility/2006" xmlns:o="urn:schemas-microsoft-com:office:office" xmlns:r="http://schemas.openxmlformats.org/officeDocument/2006/relationships" xmlns:m="http://schemas.openxmlformats.org/officeDocument/2006/math" xmlns:v="urn:schemas-microsoft-com:vml" xmlns:wp14="http://schemas.microsoft.com/office/word/2010/wordprocessingDrawing" xmlns:wp="http://schemas.openxmlformats.org/drawingml/2006/wordprocessingDrawing" xmlns:w10="urn:schemas-microsoft-com:office:word" xmlns:w="http://schemas.openxmlformats.org/wordprocessingml/2006/main" xmlns:w14="http://schemas.microsoft.com/office/word/2010/wordml" xmlns:w15="http://schemas.microsoft.com/office/word/2012/wordml" xmlns:w16se="http://schemas.microsoft.com/office/word/2015/wordml/symex" xmlns:wpg="http://schemas.microsoft.com/office/word/2010/wordprocessingGroup" xmlns:wpi="http://schemas.microsoft.com/office/word/2010/wordprocessingInk" xmlns:wne="http://schemas.microsoft.com/office/word/2006/wordml" xmlns:wps="http://schemas.microsoft.com/office/word/2010/wordprocessingShape" mc:Ignorable="w14 w15 w16se wp14">
   <w:p>
     <w:pPr>
       <w:spacing w:after="0" w:line="259" w:lineRule="auto"/>
@@ -1465,7 +1487,7 @@
 </file>
 
 <file path=word/footnotes.xml><?xml version="1.0" encoding="utf-8"?>
-<w:footnotes xmlns:wpc="http://schemas.microsoft.com/office/word/2010/wordprocessingCanvas" xmlns:cx="http://schemas.microsoft.com/office/drawing/2014/chartex" xmlns:cx1="http://schemas.microsoft.com/office/drawing/2015/9/8/chartex" xmlns:cx2="http://schemas.microsoft.com/office/drawing/2015/10/21/chartex" xmlns:cx3="http://schemas.microsoft.com/office/drawing/2016/5/9/chartex" xmlns:cx4="http://schemas.microsoft.com/office/drawing/2016/5/10/chartex" xmlns:cx5="http://schemas.microsoft.com/office/drawing/2016/5/11/chartex" xmlns:cx6="http://schemas.microsoft.com/office/drawing/2016/5/12/chartex" xmlns:cx7="http://schemas.microsoft.com/office/drawing/2016/5/13/chartex" xmlns:cx8="http://schemas.microsoft.com/office/drawing/2016/5/14/chartex" xmlns:mc="http://schemas.openxmlformats.org/markup-compatibility/2006" xmlns:aink="http://schemas.microsoft.com/office/drawing/2016/ink" xmlns:am3d="http://schemas.microsoft.com/office/drawing/2017/model3d" xmlns:o="urn:schemas-microsoft-com:office:office" xmlns:r="http://schemas.openxmlformats.org/officeDocument/2006/relationships" xmlns:m="http://schemas.openxmlformats.org/officeDocument/2006/math" xmlns:v="urn:schemas-microsoft-com:vml" xmlns:wp14="http://schemas.microsoft.com/office/word/2010/wordprocessingDrawing" xmlns:wp="http://schemas.openxmlformats.org/drawingml/2006/wordprocessingDrawing" xmlns:w10="urn:schemas-microsoft-com:office:word" xmlns:w="http://schemas.openxmlformats.org/wordprocessingml/2006/main" xmlns:w14="http://schemas.microsoft.com/office/word/2010/wordml" xmlns:w15="http://schemas.microsoft.com/office/word/2012/wordml" xmlns:w16cid="http://schemas.microsoft.com/office/word/2016/wordml/cid" xmlns:w16se="http://schemas.microsoft.com/office/word/2015/wordml/symex" xmlns:wpg="http://schemas.microsoft.com/office/word/2010/wordprocessingGroup" xmlns:wpi="http://schemas.microsoft.com/office/word/2010/wordprocessingInk" xmlns:wne="http://schemas.microsoft.com/office/word/2006/wordml" xmlns:wps="http://schemas.microsoft.com/office/word/2010/wordprocessingShape" mc:Ignorable="w14 w15 w16se w16cid wp14">
+<w:footnotes xmlns:wpc="http://schemas.microsoft.com/office/word/2010/wordprocessingCanvas" xmlns:cx="http://schemas.microsoft.com/office/drawing/2014/chartex" xmlns:mc="http://schemas.openxmlformats.org/markup-compatibility/2006" xmlns:o="urn:schemas-microsoft-com:office:office" xmlns:r="http://schemas.openxmlformats.org/officeDocument/2006/relationships" xmlns:m="http://schemas.openxmlformats.org/officeDocument/2006/math" xmlns:v="urn:schemas-microsoft-com:vml" xmlns:wp14="http://schemas.microsoft.com/office/word/2010/wordprocessingDrawing" xmlns:wp="http://schemas.openxmlformats.org/drawingml/2006/wordprocessingDrawing" xmlns:w10="urn:schemas-microsoft-com:office:word" xmlns:w="http://schemas.openxmlformats.org/wordprocessingml/2006/main" xmlns:w14="http://schemas.microsoft.com/office/word/2010/wordml" xmlns:w15="http://schemas.microsoft.com/office/word/2012/wordml" xmlns:w16se="http://schemas.microsoft.com/office/word/2015/wordml/symex" xmlns:wpg="http://schemas.microsoft.com/office/word/2010/wordprocessingGroup" xmlns:wpi="http://schemas.microsoft.com/office/word/2010/wordprocessingInk" xmlns:wne="http://schemas.microsoft.com/office/word/2006/wordml" xmlns:wps="http://schemas.microsoft.com/office/word/2010/wordprocessingShape" mc:Ignorable="w14 w15 w16se wp14">
   <w:footnote w:type="separator" w:id="-1">
     <w:p>
       <w:pPr>
@@ -1490,7 +1512,7 @@
 </file>
 
 <file path=word/numbering.xml><?xml version="1.0" encoding="utf-8"?>
-<w:numbering xmlns:wpc="http://schemas.microsoft.com/office/word/2010/wordprocessingCanvas" xmlns:cx="http://schemas.microsoft.com/office/drawing/2014/chartex" xmlns:cx1="http://schemas.microsoft.com/office/drawing/2015/9/8/chartex" xmlns:cx2="http://schemas.microsoft.com/office/drawing/2015/10/21/chartex" xmlns:cx3="http://schemas.microsoft.com/office/drawing/2016/5/9/chartex" xmlns:cx4="http://schemas.microsoft.com/office/drawing/2016/5/10/chartex" xmlns:cx5="http://schemas.microsoft.com/office/drawing/2016/5/11/chartex" xmlns:cx6="http://schemas.microsoft.com/office/drawing/2016/5/12/chartex" xmlns:cx7="http://schemas.microsoft.com/office/drawing/2016/5/13/chartex" xmlns:cx8="http://schemas.microsoft.com/office/drawing/2016/5/14/chartex" xmlns:mc="http://schemas.openxmlformats.org/markup-compatibility/2006" xmlns:aink="http://schemas.microsoft.com/office/drawing/2016/ink" xmlns:am3d="http://schemas.microsoft.com/office/drawing/2017/model3d" xmlns:o="urn:schemas-microsoft-com:office:office" xmlns:r="http://schemas.openxmlformats.org/officeDocument/2006/relationships" xmlns:m="http://schemas.openxmlformats.org/officeDocument/2006/math" xmlns:v="urn:schemas-microsoft-com:vml" xmlns:wp14="http://schemas.microsoft.com/office/word/2010/wordprocessingDrawing" xmlns:wp="http://schemas.openxmlformats.org/drawingml/2006/wordprocessingDrawing" xmlns:w10="urn:schemas-microsoft-com:office:word" xmlns:w="http://schemas.openxmlformats.org/wordprocessingml/2006/main" xmlns:w14="http://schemas.microsoft.com/office/word/2010/wordml" xmlns:w15="http://schemas.microsoft.com/office/word/2012/wordml" xmlns:w16cid="http://schemas.microsoft.com/office/word/2016/wordml/cid" xmlns:w16se="http://schemas.microsoft.com/office/word/2015/wordml/symex" xmlns:wpg="http://schemas.microsoft.com/office/word/2010/wordprocessingGroup" xmlns:wpi="http://schemas.microsoft.com/office/word/2010/wordprocessingInk" xmlns:wne="http://schemas.microsoft.com/office/word/2006/wordml" xmlns:wps="http://schemas.microsoft.com/office/word/2010/wordprocessingShape" mc:Ignorable="w14 w15 w16se w16cid wp14">
+<w:numbering xmlns:wpc="http://schemas.microsoft.com/office/word/2010/wordprocessingCanvas" xmlns:cx="http://schemas.microsoft.com/office/drawing/2014/chartex" xmlns:mc="http://schemas.openxmlformats.org/markup-compatibility/2006" xmlns:o="urn:schemas-microsoft-com:office:office" xmlns:r="http://schemas.openxmlformats.org/officeDocument/2006/relationships" xmlns:m="http://schemas.openxmlformats.org/officeDocument/2006/math" xmlns:v="urn:schemas-microsoft-com:vml" xmlns:wp14="http://schemas.microsoft.com/office/word/2010/wordprocessingDrawing" xmlns:wp="http://schemas.openxmlformats.org/drawingml/2006/wordprocessingDrawing" xmlns:w10="urn:schemas-microsoft-com:office:word" xmlns:w="http://schemas.openxmlformats.org/wordprocessingml/2006/main" xmlns:w14="http://schemas.microsoft.com/office/word/2010/wordml" xmlns:w15="http://schemas.microsoft.com/office/word/2012/wordml" xmlns:w16se="http://schemas.microsoft.com/office/word/2015/wordml/symex" xmlns:wpg="http://schemas.microsoft.com/office/word/2010/wordprocessingGroup" xmlns:wpi="http://schemas.microsoft.com/office/word/2010/wordprocessingInk" xmlns:wne="http://schemas.microsoft.com/office/word/2006/wordml" xmlns:wps="http://schemas.microsoft.com/office/word/2010/wordprocessingShape" mc:Ignorable="w14 w15 w16se wp14">
   <w:abstractNum w:abstractNumId="0" w15:restartNumberingAfterBreak="0">
     <w:nsid w:val="113D0E00"/>
     <w:multiLevelType w:val="hybridMultilevel"/>
@@ -1710,7 +1732,7 @@
 </file>
 
 <file path=word/styles.xml><?xml version="1.0" encoding="utf-8"?>
-<w:styles xmlns:mc="http://schemas.openxmlformats.org/markup-compatibility/2006" xmlns:r="http://schemas.openxmlformats.org/officeDocument/2006/relationships" xmlns:w="http://schemas.openxmlformats.org/wordprocessingml/2006/main" xmlns:w14="http://schemas.microsoft.com/office/word/2010/wordml" xmlns:w15="http://schemas.microsoft.com/office/word/2012/wordml" xmlns:w16cid="http://schemas.microsoft.com/office/word/2016/wordml/cid" xmlns:w16se="http://schemas.microsoft.com/office/word/2015/wordml/symex" mc:Ignorable="w14 w15 w16se w16cid">
+<w:styles xmlns:mc="http://schemas.openxmlformats.org/markup-compatibility/2006" xmlns:r="http://schemas.openxmlformats.org/officeDocument/2006/relationships" xmlns:w="http://schemas.openxmlformats.org/wordprocessingml/2006/main" xmlns:w14="http://schemas.microsoft.com/office/word/2010/wordml" xmlns:w15="http://schemas.microsoft.com/office/word/2012/wordml" xmlns:w16se="http://schemas.microsoft.com/office/word/2015/wordml/symex" mc:Ignorable="w14 w15 w16se">
   <w:docDefaults>
     <w:rPrDefault>
       <w:rPr>
@@ -1723,7 +1745,7 @@
     </w:rPrDefault>
     <w:pPrDefault/>
   </w:docDefaults>
-  <w:latentStyles w:defLockedState="0" w:defUIPriority="99" w:defSemiHidden="0" w:defUnhideWhenUsed="0" w:defQFormat="0" w:count="375">
+  <w:latentStyles w:defLockedState="0" w:defUIPriority="99" w:defSemiHidden="0" w:defUnhideWhenUsed="0" w:defQFormat="0" w:count="371">
     <w:lsdException w:name="Normal" w:uiPriority="0" w:qFormat="1"/>
     <w:lsdException w:name="heading 1" w:uiPriority="9" w:qFormat="1"/>
     <w:lsdException w:name="heading 2" w:semiHidden="1" w:uiPriority="9" w:unhideWhenUsed="1" w:qFormat="1"/>
@@ -2095,10 +2117,6 @@
     <w:lsdException w:name="List Table 5 Dark Accent 6" w:uiPriority="50"/>
     <w:lsdException w:name="List Table 6 Colorful Accent 6" w:uiPriority="51"/>
     <w:lsdException w:name="List Table 7 Colorful Accent 6" w:uiPriority="52"/>
-    <w:lsdException w:name="Mention" w:semiHidden="1" w:unhideWhenUsed="1"/>
-    <w:lsdException w:name="Smart Hyperlink" w:semiHidden="1" w:unhideWhenUsed="1"/>
-    <w:lsdException w:name="Hashtag" w:semiHidden="1" w:unhideWhenUsed="1"/>
-    <w:lsdException w:name="Unresolved Mention" w:semiHidden="1" w:unhideWhenUsed="1"/>
   </w:latentStyles>
   <w:style w:type="paragraph" w:default="1" w:styleId="a">
     <w:name w:val="Normal"/>
@@ -2198,7 +2216,7 @@
       <w:u w:val="single"/>
     </w:rPr>
   </w:style>
-  <w:style w:type="character" w:styleId="a7">
+  <w:style w:type="character" w:customStyle="1" w:styleId="UnresolvedMention">
     <w:name w:val="Unresolved Mention"/>
     <w:basedOn w:val="a0"/>
     <w:uiPriority w:val="99"/>

</xml_diff>